<commit_message>
feat(docx): embed Montserrat and lay out bracket.docx like the web sheet
Sidebar gray, bracket, photo block and page strip are page-anchored shapes in the headers, so page 1's
gray starts under the header and later pages' runs full height; sizes and line heights follow the CSS.
Montserrat (OFL, assets/fonts) is embedded as obfuscated .odttf.

Fixes: bullets took python-docx's built-in list instead of the template's (pro's colored bullets never
showed); headings ignored the named font because Word's heading styles carry a theme font.
</commit_message>
<xml_diff>
--- a/templates/bracket.docx
+++ b/templates/bracket.docx
@@ -6,7 +6,6 @@
       <w:tblPr>
         <w:tblW w:type="auto" w:w="0"/>
         <w:jc w:val="left"/>
-        <w:tblInd w:w="396" w:type="dxa"/>
         <w:tblLayout w:type="fixed"/>
         <w:tblCellMar>
           <w:left w:w="0" w:type="dxa"/>
@@ -15,79 +14,40 @@
         <w:tblLook w:firstColumn="1" w:firstRow="1" w:lastColumn="0" w:lastRow="0" w:noHBand="0" w:noVBand="1" w:val="04A0"/>
       </w:tblPr>
       <w:tblGrid>
-        <w:gridCol w:w="2665"/>
-        <w:gridCol w:w="5443"/>
+        <w:gridCol w:w="3231"/>
+        <w:gridCol w:w="5272"/>
         <w:gridCol w:w="3402"/>
       </w:tblGrid>
       <w:tr>
+        <w:trPr>
+          <w:trHeight w:val="2551" w:hRule="exact"/>
+        </w:trPr>
         <w:tc>
           <w:tcPr>
-            <w:tcW w:type="dxa" w:w="2665"/>
-            <w:tcBorders>
-              <w:top w:val="single" w:sz="96" w:space="0" w:color="F6B92B"/>
-              <w:left w:val="single" w:sz="96" w:space="0" w:color="F6B92B"/>
-            </w:tcBorders>
+            <w:tcW w:type="dxa" w:w="3231"/>
             <w:tcMar>
-              <w:top w:w="283" w:type="dxa"/>
-              <w:left w:w="340" w:type="dxa"/>
-              <w:bottom w:w="170" w:type="dxa"/>
+              <w:top w:w="510" w:type="dxa"/>
+              <w:left w:w="907" w:type="dxa"/>
+              <w:bottom w:w="0" w:type="dxa"/>
               <w:right w:w="0" w:type="dxa"/>
             </w:tcMar>
-            <w:vAlign w:val="center"/>
           </w:tcPr>
-          <w:tbl>
-            <w:tblPr>
-              <w:tblW w:type="auto" w:w="0"/>
-              <w:jc w:val="left"/>
-              <w:tblLayout w:type="fixed"/>
-              <w:tblCellMar>
-                <w:left w:w="0" w:type="dxa"/>
-                <w:right w:w="0" w:type="dxa"/>
-              </w:tblCellMar>
-              <w:tblLook w:firstColumn="1" w:firstRow="1" w:lastColumn="0" w:lastRow="0" w:noHBand="0" w:noVBand="1" w:val="04A0"/>
-            </w:tblPr>
-            <w:tblGrid>
-              <w:gridCol w:w="1928"/>
-            </w:tblGrid>
-            <w:tr>
-              <w:tc>
-                <w:tcPr>
-                  <w:tcW w:type="dxa" w:w="1928"/>
-                  <w:tcBorders>
-                    <w:bottom w:val="single" w:sz="96" w:space="0" w:color="F6B92B"/>
-                    <w:right w:val="single" w:sz="96" w:space="0" w:color="F6B92B"/>
-                  </w:tcBorders>
-                  <w:tcMar>
-                    <w:top w:w="0" w:type="dxa"/>
-                    <w:left w:w="0" w:type="dxa"/>
-                    <w:bottom w:w="0" w:type="dxa"/>
-                    <w:right w:w="0" w:type="dxa"/>
-                  </w:tcMar>
-                </w:tcPr>
-                <w:p>
-                  <w:pPr>
-                    <w:pStyle w:val="CVPhoto"/>
-                  </w:pPr>
-                  <w:r>
-                    <w:t>{Photo 3.1 gray}</w:t>
-                  </w:r>
-                </w:p>
-              </w:tc>
-            </w:tr>
-          </w:tbl>
           <w:p>
             <w:pPr>
               <w:pStyle w:val="CVPhoto"/>
             </w:pPr>
+            <w:r>
+              <w:t>{Photo 3.1 gray}</w:t>
+            </w:r>
           </w:p>
         </w:tc>
         <w:tc>
           <w:tcPr>
-            <w:tcW w:type="dxa" w:w="5443"/>
+            <w:tcW w:type="dxa" w:w="5272"/>
             <w:tcMar>
               <w:top w:w="510" w:type="dxa"/>
-              <w:left w:w="113" w:type="dxa"/>
-              <w:bottom w:w="170" w:type="dxa"/>
+              <w:left w:w="340" w:type="dxa"/>
+              <w:bottom w:w="0" w:type="dxa"/>
               <w:right w:w="226" w:type="dxa"/>
             </w:tcMar>
             <w:vAlign w:val="center"/>
@@ -115,7 +75,7 @@
             <w:tcMar>
               <w:top w:w="510" w:type="dxa"/>
               <w:left w:w="226" w:type="dxa"/>
-              <w:bottom w:w="170" w:type="dxa"/>
+              <w:bottom w:w="0" w:type="dxa"/>
               <w:right w:w="793" w:type="dxa"/>
             </w:tcMar>
             <w:vAlign w:val="center"/>
@@ -131,14 +91,17 @@
         </w:tc>
       </w:tr>
       <w:tr>
+        <w:trPr>
+          <w:trHeight w:val="1361" w:hRule="exact"/>
+        </w:trPr>
         <w:tc>
           <w:tcPr>
-            <w:tcW w:type="dxa" w:w="11509"/>
+            <w:tcW w:type="dxa" w:w="11906"/>
             <w:gridSpan w:val="3"/>
             <w:tcMar>
-              <w:top w:w="340" w:type="dxa"/>
-              <w:left w:w="510" w:type="dxa"/>
-              <w:bottom w:w="453" w:type="dxa"/>
+              <w:top w:w="226" w:type="dxa"/>
+              <w:left w:w="907" w:type="dxa"/>
+              <w:bottom w:w="0" w:type="dxa"/>
               <w:right w:w="793" w:type="dxa"/>
             </w:tcMar>
           </w:tcPr>
@@ -177,17 +140,16 @@
         <w:tc>
           <w:tcPr>
             <w:tcW w:type="dxa" w:w="3628"/>
-            <w:shd w:val="clear" w:color="auto" w:fill="F4F3EF"/>
             <w:tcMar>
-              <w:top w:w="567" w:type="dxa"/>
+              <w:top w:w="170" w:type="dxa"/>
               <w:left w:w="567" w:type="dxa"/>
-              <w:bottom w:w="680" w:type="dxa"/>
+              <w:bottom w:w="0" w:type="dxa"/>
               <w:right w:w="453" w:type="dxa"/>
             </w:tcMar>
           </w:tcPr>
           <w:p>
             <w:pPr>
-              <w:pStyle w:val="SidebarSectionsSpacing"/>
+              <w:pStyle w:val="CVPhoto"/>
             </w:pPr>
           </w:p>
         </w:tc>
@@ -197,7 +159,7 @@
             <w:tcMar>
               <w:top w:w="567" w:type="dxa"/>
               <w:left w:w="567" w:type="dxa"/>
-              <w:bottom w:w="680" w:type="dxa"/>
+              <w:bottom w:w="0" w:type="dxa"/>
               <w:right w:w="793" w:type="dxa"/>
             </w:tcMar>
           </w:tcPr>
@@ -211,33 +173,365 @@
       </w:pPr>
     </w:p>
     <w:sectPr>
-      <w:footerReference w:type="default" r:id="rId9"/>
+      <w:headerReference w:type="first" r:id="rId9"/>
+      <w:headerReference w:type="default" r:id="rId10"/>
       <w:pgSz w:w="11906" w:h="16838"/>
-      <w:pgMar w:top="680" w:right="0" w:bottom="794" w:left="0" w:header="0" w:footer="0" w:gutter="0"/>
+      <w:pgMar w:top="397" w:right="0" w:bottom="680" w:left="0" w:header="0" w:footer="0" w:gutter="0"/>
       <w:cols w:space="720"/>
+      <w:titlePg/>
       <w:docGrid w:linePitch="360"/>
     </w:sectPr>
   </w:body>
 </w:document>
 </file>
 
-<file path=word/footer1.xml><?xml version="1.0" encoding="utf-8"?>
-<w:ftr xmlns:m="http://schemas.openxmlformats.org/officeDocument/2006/math" xmlns:mc="http://schemas.openxmlformats.org/markup-compatibility/2006" xmlns:mo="http://schemas.microsoft.com/office/mac/office/2008/main" xmlns:mv="urn:schemas-microsoft-com:mac:vml" xmlns:o="urn:schemas-microsoft-com:office:office" xmlns:r="http://schemas.openxmlformats.org/officeDocument/2006/relationships" xmlns:v="urn:schemas-microsoft-com:vml" xmlns:w10="urn:schemas-microsoft-com:office:word" xmlns:w14="http://schemas.microsoft.com/office/word/2010/wordml" xmlns:w="http://schemas.openxmlformats.org/wordprocessingml/2006/main" xmlns:wne="http://schemas.microsoft.com/office/word/2006/wordml" xmlns:wp14="http://schemas.microsoft.com/office/word/2010/wordprocessingDrawing" xmlns:wp="http://schemas.openxmlformats.org/drawingml/2006/wordprocessingDrawing" xmlns:wpc="http://schemas.microsoft.com/office/word/2010/wordprocessingCanvas" xmlns:wpg="http://schemas.microsoft.com/office/word/2010/wordprocessingGroup" xmlns:wpi="http://schemas.microsoft.com/office/word/2010/wordprocessingInk" xmlns:wps="http://schemas.microsoft.com/office/word/2010/wordprocessingShape" mc:Ignorable="w14 wp14">
+<file path=word/header1.xml><?xml version="1.0" encoding="utf-8"?>
+<w:hdr xmlns:m="http://schemas.openxmlformats.org/officeDocument/2006/math" xmlns:mc="http://schemas.openxmlformats.org/markup-compatibility/2006" xmlns:mo="http://schemas.microsoft.com/office/mac/office/2008/main" xmlns:mv="urn:schemas-microsoft-com:mac:vml" xmlns:o="urn:schemas-microsoft-com:office:office" xmlns:r="http://schemas.openxmlformats.org/officeDocument/2006/relationships" xmlns:v="urn:schemas-microsoft-com:vml" xmlns:w10="urn:schemas-microsoft-com:office:word" xmlns:w14="http://schemas.microsoft.com/office/word/2010/wordml" xmlns:w="http://schemas.openxmlformats.org/wordprocessingml/2006/main" xmlns:wne="http://schemas.microsoft.com/office/word/2006/wordml" xmlns:wp14="http://schemas.microsoft.com/office/word/2010/wordprocessingDrawing" xmlns:wp="http://schemas.openxmlformats.org/drawingml/2006/wordprocessingDrawing" xmlns:wpc="http://schemas.microsoft.com/office/word/2010/wordprocessingCanvas" xmlns:wpg="http://schemas.microsoft.com/office/word/2010/wordprocessingGroup" xmlns:wpi="http://schemas.microsoft.com/office/word/2010/wordprocessingInk" xmlns:wps="http://schemas.microsoft.com/office/word/2010/wordprocessingShape" mc:Ignorable="w14 wp14">
   <w:p>
     <w:pPr>
-      <w:pStyle w:val="Footer"/>
-      <w:spacing w:after="0"/>
-      <w:jc w:val="right"/>
-    </w:pPr>
-    <w:r>
-      <w:rPr>
-        <w:sz w:val="26"/>
-        <w:shd w:val="clear" w:color="auto" w:fill="F6B92B"/>
-      </w:rPr>
-      <w:t xml:space="preserve">                      </w:t>
+      <w:pStyle w:val="CVPhoto"/>
+    </w:pPr>
+    <w:r xmlns:a="http://schemas.openxmlformats.org/drawingml/2006/main">
+      <w:drawing>
+        <wp:anchor distT="0" distB="0" distL="0" distR="0" simplePos="0" relativeHeight="1001" behindDoc="1" locked="1" layoutInCell="0" allowOverlap="1">
+          <wp:simplePos x="0" y="0"/>
+          <wp:positionH relativeFrom="page">
+            <wp:posOffset>252000</wp:posOffset>
+          </wp:positionH>
+          <wp:positionV relativeFrom="page">
+            <wp:posOffset>252000</wp:posOffset>
+          </wp:positionV>
+          <wp:extent cx="2160000" cy="180000"/>
+          <wp:effectExtent l="0" t="0" r="0" b="0"/>
+          <wp:wrapNone/>
+          <wp:docPr id="1001" name="Shape 1001"/>
+          <wp:cNvGraphicFramePr/>
+          <a:graphic>
+            <a:graphicData uri="http://schemas.microsoft.com/office/word/2010/wordprocessingShape">
+              <wps:wsp>
+                <wps:cNvSpPr/>
+                <wps:spPr>
+                  <a:xfrm>
+                    <a:off x="0" y="0"/>
+                    <a:ext cx="2160000" cy="180000"/>
+                  </a:xfrm>
+                  <a:prstGeom prst="rect">
+                    <a:avLst/>
+                  </a:prstGeom>
+                  <a:solidFill>
+                    <a:srgbClr val="F6B92B"/>
+                  </a:solidFill>
+                  <a:ln>
+                    <a:noFill/>
+                  </a:ln>
+                </wps:spPr>
+                <wps:bodyPr/>
+              </wps:wsp>
+            </a:graphicData>
+          </a:graphic>
+        </wp:anchor>
+      </w:drawing>
+    </w:r>
+    <w:r xmlns:a="http://schemas.openxmlformats.org/drawingml/2006/main">
+      <w:drawing>
+        <wp:anchor distT="0" distB="0" distL="0" distR="0" simplePos="0" relativeHeight="1002" behindDoc="1" locked="1" layoutInCell="0" allowOverlap="1">
+          <wp:simplePos x="0" y="0"/>
+          <wp:positionH relativeFrom="page">
+            <wp:posOffset>252000</wp:posOffset>
+          </wp:positionH>
+          <wp:positionV relativeFrom="page">
+            <wp:posOffset>252000</wp:posOffset>
+          </wp:positionV>
+          <wp:extent cx="180000" cy="1080000"/>
+          <wp:effectExtent l="0" t="0" r="0" b="0"/>
+          <wp:wrapNone/>
+          <wp:docPr id="1002" name="Shape 1002"/>
+          <wp:cNvGraphicFramePr/>
+          <a:graphic>
+            <a:graphicData uri="http://schemas.microsoft.com/office/word/2010/wordprocessingShape">
+              <wps:wsp>
+                <wps:cNvSpPr/>
+                <wps:spPr>
+                  <a:xfrm>
+                    <a:off x="0" y="0"/>
+                    <a:ext cx="180000" cy="1080000"/>
+                  </a:xfrm>
+                  <a:prstGeom prst="rect">
+                    <a:avLst/>
+                  </a:prstGeom>
+                  <a:solidFill>
+                    <a:srgbClr val="F6B92B"/>
+                  </a:solidFill>
+                  <a:ln>
+                    <a:noFill/>
+                  </a:ln>
+                </wps:spPr>
+                <wps:bodyPr/>
+              </wps:wsp>
+            </a:graphicData>
+          </a:graphic>
+        </wp:anchor>
+      </w:drawing>
+    </w:r>
+    <w:r xmlns:a="http://schemas.openxmlformats.org/drawingml/2006/main">
+      <w:drawing>
+        <wp:anchor distT="0" distB="0" distL="0" distR="0" simplePos="0" relativeHeight="1003" behindDoc="1" locked="1" layoutInCell="0" allowOverlap="1">
+          <wp:simplePos x="0" y="0"/>
+          <wp:positionH relativeFrom="page">
+            <wp:posOffset>504000</wp:posOffset>
+          </wp:positionH>
+          <wp:positionV relativeFrom="page">
+            <wp:posOffset>432000</wp:posOffset>
+          </wp:positionV>
+          <wp:extent cx="79200" cy="79200"/>
+          <wp:effectExtent l="0" t="0" r="0" b="0"/>
+          <wp:wrapNone/>
+          <wp:docPr id="1003" name="Shape 1003"/>
+          <wp:cNvGraphicFramePr/>
+          <a:graphic>
+            <a:graphicData uri="http://schemas.microsoft.com/office/word/2010/wordprocessingShape">
+              <wps:wsp>
+                <wps:cNvSpPr/>
+                <wps:spPr>
+                  <a:xfrm>
+                    <a:off x="0" y="0"/>
+                    <a:ext cx="79200" cy="79200"/>
+                  </a:xfrm>
+                  <a:prstGeom prst="rect">
+                    <a:avLst/>
+                  </a:prstGeom>
+                  <a:solidFill>
+                    <a:srgbClr val="262626"/>
+                  </a:solidFill>
+                  <a:ln>
+                    <a:noFill/>
+                  </a:ln>
+                </wps:spPr>
+                <wps:bodyPr/>
+              </wps:wsp>
+            </a:graphicData>
+          </a:graphic>
+        </wp:anchor>
+      </w:drawing>
+    </w:r>
+    <w:r xmlns:a="http://schemas.openxmlformats.org/drawingml/2006/main">
+      <w:drawing>
+        <wp:anchor distT="0" distB="0" distL="0" distR="0" simplePos="0" relativeHeight="1004" behindDoc="1" locked="1" layoutInCell="0" allowOverlap="1">
+          <wp:simplePos x="0" y="0"/>
+          <wp:positionH relativeFrom="page">
+            <wp:posOffset>684000</wp:posOffset>
+          </wp:positionH>
+          <wp:positionV relativeFrom="page">
+            <wp:posOffset>684000</wp:posOffset>
+          </wp:positionV>
+          <wp:extent cx="1116000" cy="1116000"/>
+          <wp:effectExtent l="0" t="0" r="0" b="0"/>
+          <wp:wrapNone/>
+          <wp:docPr id="1004" name="Shape 1004"/>
+          <wp:cNvGraphicFramePr/>
+          <a:graphic>
+            <a:graphicData uri="http://schemas.microsoft.com/office/word/2010/wordprocessingShape">
+              <wps:wsp>
+                <wps:cNvSpPr/>
+                <wps:spPr>
+                  <a:xfrm>
+                    <a:off x="0" y="0"/>
+                    <a:ext cx="1116000" cy="1116000"/>
+                  </a:xfrm>
+                  <a:prstGeom prst="rect">
+                    <a:avLst/>
+                  </a:prstGeom>
+                  <a:solidFill>
+                    <a:srgbClr val="F6B92B"/>
+                  </a:solidFill>
+                  <a:ln>
+                    <a:noFill/>
+                  </a:ln>
+                </wps:spPr>
+                <wps:bodyPr/>
+              </wps:wsp>
+            </a:graphicData>
+          </a:graphic>
+        </wp:anchor>
+      </w:drawing>
+    </w:r>
+    <w:r xmlns:a="http://schemas.openxmlformats.org/drawingml/2006/main">
+      <w:drawing>
+        <wp:anchor distT="0" distB="0" distL="0" distR="0" simplePos="0" relativeHeight="1005" behindDoc="1" locked="1" layoutInCell="0" allowOverlap="1">
+          <wp:simplePos x="0" y="0"/>
+          <wp:positionH relativeFrom="page">
+            <wp:posOffset>0</wp:posOffset>
+          </wp:positionH>
+          <wp:positionV relativeFrom="page">
+            <wp:posOffset>2736000</wp:posOffset>
+          </wp:positionV>
+          <wp:extent cx="2304000" cy="7956000"/>
+          <wp:effectExtent l="0" t="0" r="0" b="0"/>
+          <wp:wrapNone/>
+          <wp:docPr id="1005" name="Shape 1005"/>
+          <wp:cNvGraphicFramePr/>
+          <a:graphic>
+            <a:graphicData uri="http://schemas.microsoft.com/office/word/2010/wordprocessingShape">
+              <wps:wsp>
+                <wps:cNvSpPr/>
+                <wps:spPr>
+                  <a:xfrm>
+                    <a:off x="0" y="0"/>
+                    <a:ext cx="2304000" cy="7956000"/>
+                  </a:xfrm>
+                  <a:prstGeom prst="rect">
+                    <a:avLst/>
+                  </a:prstGeom>
+                  <a:solidFill>
+                    <a:srgbClr val="F4F3EF"/>
+                  </a:solidFill>
+                  <a:ln>
+                    <a:noFill/>
+                  </a:ln>
+                </wps:spPr>
+                <wps:bodyPr/>
+              </wps:wsp>
+            </a:graphicData>
+          </a:graphic>
+        </wp:anchor>
+      </w:drawing>
+    </w:r>
+    <w:r xmlns:a="http://schemas.openxmlformats.org/drawingml/2006/main">
+      <w:drawing>
+        <wp:anchor distT="0" distB="0" distL="0" distR="0" simplePos="0" relativeHeight="1006" behindDoc="1" locked="1" layoutInCell="0" allowOverlap="1">
+          <wp:simplePos x="0" y="0"/>
+          <wp:positionH relativeFrom="page">
+            <wp:posOffset>6768000</wp:posOffset>
+          </wp:positionH>
+          <wp:positionV relativeFrom="page">
+            <wp:posOffset>10512000</wp:posOffset>
+          </wp:positionV>
+          <wp:extent cx="792000" cy="180000"/>
+          <wp:effectExtent l="0" t="0" r="0" b="0"/>
+          <wp:wrapNone/>
+          <wp:docPr id="1006" name="Shape 1006"/>
+          <wp:cNvGraphicFramePr/>
+          <a:graphic>
+            <a:graphicData uri="http://schemas.microsoft.com/office/word/2010/wordprocessingShape">
+              <wps:wsp>
+                <wps:cNvSpPr/>
+                <wps:spPr>
+                  <a:xfrm>
+                    <a:off x="0" y="0"/>
+                    <a:ext cx="792000" cy="180000"/>
+                  </a:xfrm>
+                  <a:prstGeom prst="rect">
+                    <a:avLst/>
+                  </a:prstGeom>
+                  <a:solidFill>
+                    <a:srgbClr val="F6B92B"/>
+                  </a:solidFill>
+                  <a:ln>
+                    <a:noFill/>
+                  </a:ln>
+                </wps:spPr>
+                <wps:bodyPr/>
+              </wps:wsp>
+            </a:graphicData>
+          </a:graphic>
+        </wp:anchor>
+      </w:drawing>
     </w:r>
   </w:p>
-</w:ftr>
+</w:hdr>
+</file>
+
+<file path=word/header2.xml><?xml version="1.0" encoding="utf-8"?>
+<w:hdr xmlns:m="http://schemas.openxmlformats.org/officeDocument/2006/math" xmlns:mc="http://schemas.openxmlformats.org/markup-compatibility/2006" xmlns:mo="http://schemas.microsoft.com/office/mac/office/2008/main" xmlns:mv="urn:schemas-microsoft-com:mac:vml" xmlns:o="urn:schemas-microsoft-com:office:office" xmlns:r="http://schemas.openxmlformats.org/officeDocument/2006/relationships" xmlns:v="urn:schemas-microsoft-com:vml" xmlns:w10="urn:schemas-microsoft-com:office:word" xmlns:w14="http://schemas.microsoft.com/office/word/2010/wordml" xmlns:w="http://schemas.openxmlformats.org/wordprocessingml/2006/main" xmlns:wne="http://schemas.microsoft.com/office/word/2006/wordml" xmlns:wp14="http://schemas.microsoft.com/office/word/2010/wordprocessingDrawing" xmlns:wp="http://schemas.openxmlformats.org/drawingml/2006/wordprocessingDrawing" xmlns:wpc="http://schemas.microsoft.com/office/word/2010/wordprocessingCanvas" xmlns:wpg="http://schemas.microsoft.com/office/word/2010/wordprocessingGroup" xmlns:wpi="http://schemas.microsoft.com/office/word/2010/wordprocessingInk" xmlns:wps="http://schemas.microsoft.com/office/word/2010/wordprocessingShape" mc:Ignorable="w14 wp14">
+  <w:p>
+    <w:pPr>
+      <w:pStyle w:val="CVPhoto"/>
+      <w:spacing w:before="737"/>
+    </w:pPr>
+    <w:r xmlns:a="http://schemas.openxmlformats.org/drawingml/2006/main">
+      <w:drawing>
+        <wp:anchor distT="0" distB="0" distL="0" distR="0" simplePos="0" relativeHeight="1101" behindDoc="1" locked="1" layoutInCell="0" allowOverlap="1">
+          <wp:simplePos x="0" y="0"/>
+          <wp:positionH relativeFrom="page">
+            <wp:posOffset>0</wp:posOffset>
+          </wp:positionH>
+          <wp:positionV relativeFrom="page">
+            <wp:posOffset>0</wp:posOffset>
+          </wp:positionV>
+          <wp:extent cx="2304000" cy="10692000"/>
+          <wp:effectExtent l="0" t="0" r="0" b="0"/>
+          <wp:wrapNone/>
+          <wp:docPr id="1101" name="Shape 1101"/>
+          <wp:cNvGraphicFramePr/>
+          <a:graphic>
+            <a:graphicData uri="http://schemas.microsoft.com/office/word/2010/wordprocessingShape">
+              <wps:wsp>
+                <wps:cNvSpPr/>
+                <wps:spPr>
+                  <a:xfrm>
+                    <a:off x="0" y="0"/>
+                    <a:ext cx="2304000" cy="10692000"/>
+                  </a:xfrm>
+                  <a:prstGeom prst="rect">
+                    <a:avLst/>
+                  </a:prstGeom>
+                  <a:solidFill>
+                    <a:srgbClr val="F4F3EF"/>
+                  </a:solidFill>
+                  <a:ln>
+                    <a:noFill/>
+                  </a:ln>
+                </wps:spPr>
+                <wps:bodyPr/>
+              </wps:wsp>
+            </a:graphicData>
+          </a:graphic>
+        </wp:anchor>
+      </w:drawing>
+    </w:r>
+    <w:r xmlns:a="http://schemas.openxmlformats.org/drawingml/2006/main">
+      <w:drawing>
+        <wp:anchor distT="0" distB="0" distL="0" distR="0" simplePos="0" relativeHeight="1102" behindDoc="1" locked="1" layoutInCell="0" allowOverlap="1">
+          <wp:simplePos x="0" y="0"/>
+          <wp:positionH relativeFrom="page">
+            <wp:posOffset>6768000</wp:posOffset>
+          </wp:positionH>
+          <wp:positionV relativeFrom="page">
+            <wp:posOffset>10512000</wp:posOffset>
+          </wp:positionV>
+          <wp:extent cx="792000" cy="180000"/>
+          <wp:effectExtent l="0" t="0" r="0" b="0"/>
+          <wp:wrapNone/>
+          <wp:docPr id="1102" name="Shape 1102"/>
+          <wp:cNvGraphicFramePr/>
+          <a:graphic>
+            <a:graphicData uri="http://schemas.microsoft.com/office/word/2010/wordprocessingShape">
+              <wps:wsp>
+                <wps:cNvSpPr/>
+                <wps:spPr>
+                  <a:xfrm>
+                    <a:off x="0" y="0"/>
+                    <a:ext cx="792000" cy="180000"/>
+                  </a:xfrm>
+                  <a:prstGeom prst="rect">
+                    <a:avLst/>
+                  </a:prstGeom>
+                  <a:solidFill>
+                    <a:srgbClr val="F6B92B"/>
+                  </a:solidFill>
+                  <a:ln>
+                    <a:noFill/>
+                  </a:ln>
+                </wps:spPr>
+                <wps:bodyPr/>
+              </wps:wsp>
+            </a:graphicData>
+          </a:graphic>
+        </wp:anchor>
+      </w:drawing>
+    </w:r>
+  </w:p>
+</w:hdr>
 </file>
 
 <file path=word/numbering.xml><?xml version="1.0" encoding="utf-8"?>
@@ -249,12 +543,12 @@
       <w:lvlText w:val="•"/>
       <w:lvlJc w:val="left"/>
       <w:pPr>
-        <w:ind w:left="284" w:hanging="227"/>
+        <w:ind w:left="624" w:hanging="284"/>
       </w:pPr>
       <w:rPr>
         <w:rFonts w:ascii="Segoe UI Symbol" w:hAnsi="Segoe UI Symbol"/>
         <w:color w:val="F6B92B"/>
-        <w:sz w:val="18"/>
+        <w:sz w:val="20"/>
       </w:rPr>
     </w:lvl>
   </w:abstractNum>
@@ -265,12 +559,12 @@
       <w:lvlText w:val="◆"/>
       <w:lvlJc w:val="left"/>
       <w:pPr>
-        <w:ind w:left="340" w:hanging="340"/>
+        <w:ind w:left="400" w:hanging="400"/>
       </w:pPr>
       <w:rPr>
         <w:rFonts w:ascii="Segoe UI Symbol" w:hAnsi="Segoe UI Symbol"/>
         <w:color w:val="F6B92B"/>
-        <w:sz w:val="16"/>
+        <w:sz w:val="22"/>
       </w:rPr>
     </w:lvl>
   </w:abstractNum>
@@ -286,7 +580,7 @@
       <w:rPr>
         <w:rFonts w:ascii="Segoe UI Symbol" w:hAnsi="Segoe UI Symbol"/>
         <w:color w:val="262626"/>
-        <w:sz w:val="18"/>
+        <w:sz w:val="24"/>
       </w:rPr>
     </w:lvl>
   </w:abstractNum>
@@ -662,7 +956,7 @@
     <w:rsid w:val="00FC693F"/>
     <w:pPr>
       <w:keepNext w:val="0"/>
-      <w:spacing w:before="0" w:after="80" w:line="312" w:lineRule="auto"/>
+      <w:spacing w:before="0" w:after="80" w:line="315" w:lineRule="auto"/>
     </w:pPr>
     <w:rPr>
       <w:rFonts w:ascii="Montserrat" w:hAnsi="Montserrat" w:eastAsia="Montserrat"/>
@@ -670,7 +964,7 @@
       <w:i w:val="0"/>
       <w:caps w:val="0"/>
       <w:color w:val="222222"/>
-      <w:sz w:val="18"/>
+      <w:sz w:val="19"/>
     </w:rPr>
   </w:style>
   <w:style w:type="paragraph" w:styleId="Header">
@@ -731,17 +1025,17 @@
       <w:numPr>
         <w:numId w:val="91"/>
       </w:numPr>
-      <w:spacing w:before="0" w:after="160" w:line="276" w:lineRule="auto"/>
+      <w:spacing w:before="0" w:after="160" w:line="236" w:lineRule="auto"/>
       <w:outlineLvl w:val="0"/>
     </w:pPr>
     <w:rPr>
-      <w:rFonts w:asciiTheme="majorHAnsi" w:eastAsiaTheme="majorEastAsia" w:hAnsiTheme="majorHAnsi" w:cstheme="majorBidi" w:ascii="Montserrat" w:hAnsi="Montserrat" w:eastAsia="Montserrat"/>
+      <w:rFonts w:ascii="Montserrat" w:hAnsi="Montserrat" w:eastAsia="Montserrat"/>
       <w:b/>
       <w:bCs/>
       <w:i w:val="0"/>
       <w:caps w:val="0"/>
       <w:color w:val="222222"/>
-      <w:sz w:val="26"/>
+      <w:sz w:val="25"/>
       <w:szCs w:val="28"/>
     </w:rPr>
   </w:style>
@@ -757,11 +1051,11 @@
     <w:pPr>
       <w:keepNext/>
       <w:keepLines/>
-      <w:spacing w:before="80" w:after="0" w:line="276" w:lineRule="auto"/>
+      <w:spacing w:before="80" w:after="0" w:line="315" w:lineRule="auto"/>
       <w:outlineLvl w:val="1"/>
     </w:pPr>
     <w:rPr>
-      <w:rFonts w:asciiTheme="majorHAnsi" w:eastAsiaTheme="majorEastAsia" w:hAnsiTheme="majorHAnsi" w:cstheme="majorBidi" w:ascii="Montserrat" w:hAnsi="Montserrat" w:eastAsia="Montserrat"/>
+      <w:rFonts w:ascii="Montserrat" w:hAnsi="Montserrat" w:eastAsia="Montserrat"/>
       <w:b/>
       <w:bCs/>
       <w:i w:val="0"/>
@@ -786,11 +1080,11 @@
       <w:numPr>
         <w:numId w:val="91"/>
       </w:numPr>
-      <w:spacing w:before="0" w:after="100" w:line="276" w:lineRule="auto"/>
+      <w:spacing w:before="0" w:after="120" w:line="236" w:lineRule="auto"/>
       <w:outlineLvl w:val="2"/>
     </w:pPr>
     <w:rPr>
-      <w:rFonts w:asciiTheme="majorHAnsi" w:eastAsiaTheme="majorEastAsia" w:hAnsiTheme="majorHAnsi" w:cstheme="majorBidi" w:ascii="Montserrat" w:hAnsi="Montserrat" w:eastAsia="Montserrat"/>
+      <w:rFonts w:ascii="Montserrat" w:hAnsi="Montserrat" w:eastAsia="Montserrat"/>
       <w:b/>
       <w:bCs/>
       <w:i w:val="0"/>
@@ -812,11 +1106,11 @@
     <w:pPr>
       <w:keepNext/>
       <w:keepLines/>
-      <w:spacing w:before="100" w:after="0" w:line="276" w:lineRule="auto"/>
+      <w:spacing w:before="120" w:after="0" w:line="315" w:lineRule="auto"/>
       <w:outlineLvl w:val="3"/>
     </w:pPr>
     <w:rPr>
-      <w:rFonts w:asciiTheme="majorHAnsi" w:eastAsiaTheme="majorEastAsia" w:hAnsiTheme="majorHAnsi" w:cstheme="majorBidi" w:ascii="Montserrat" w:hAnsi="Montserrat" w:eastAsia="Montserrat"/>
+      <w:rFonts w:ascii="Montserrat" w:hAnsi="Montserrat" w:eastAsia="Montserrat"/>
       <w:b/>
       <w:bCs/>
       <w:i w:val="0"/>
@@ -1107,8 +1401,8 @@
     <w:rsid w:val="00FC693F"/>
     <w:pPr>
       <w:keepNext w:val="0"/>
-      <w:spacing w:before="0" w:after="40" w:line="276" w:lineRule="auto"/>
-      <w:ind w:left="720"/>
+      <w:spacing w:before="0" w:after="40" w:line="315" w:lineRule="auto"/>
+      <w:ind w:left="340"/>
       <w:contextualSpacing/>
     </w:pPr>
     <w:rPr>
@@ -1117,7 +1411,7 @@
       <w:i w:val="0"/>
       <w:caps w:val="0"/>
       <w:color w:val="222222"/>
-      <w:sz w:val="18"/>
+      <w:sz w:val="19"/>
     </w:rPr>
   </w:style>
   <w:style w:type="paragraph" w:styleId="BodyText">
@@ -12386,7 +12680,7 @@
     <w:basedOn w:val="Normal"/>
     <w:pPr>
       <w:keepNext w:val="0"/>
-      <w:spacing w:before="0" w:after="0" w:line="240" w:lineRule="auto"/>
+      <w:spacing w:before="0" w:after="0" w:line="197" w:lineRule="auto"/>
     </w:pPr>
     <w:rPr>
       <w:rFonts w:ascii="Montserrat" w:hAnsi="Montserrat" w:eastAsia="Montserrat"/>
@@ -12394,7 +12688,7 @@
       <w:i w:val="0"/>
       <w:caps/>
       <w:color w:val="222222"/>
-      <w:sz w:val="54"/>
+      <w:sz w:val="55"/>
     </w:rPr>
   </w:style>
   <w:style w:type="paragraph" w:customStyle="1" w:styleId="JobTitle">
@@ -12402,7 +12696,7 @@
     <w:basedOn w:val="Normal"/>
     <w:pPr>
       <w:keepNext w:val="0"/>
-      <w:spacing w:before="0" w:after="60" w:line="276" w:lineRule="auto"/>
+      <w:spacing w:before="0" w:after="60" w:line="315" w:lineRule="auto"/>
     </w:pPr>
     <w:rPr>
       <w:rFonts w:ascii="Montserrat" w:hAnsi="Montserrat" w:eastAsia="Montserrat"/>
@@ -12410,7 +12704,7 @@
       <w:i w:val="0"/>
       <w:caps/>
       <w:color w:val="7A7A7A"/>
-      <w:sz w:val="14"/>
+      <w:sz w:val="13"/>
       <w:spacing w:val="26"/>
     </w:rPr>
   </w:style>
@@ -12419,7 +12713,7 @@
     <w:basedOn w:val="Normal"/>
     <w:pPr>
       <w:keepNext w:val="0"/>
-      <w:spacing w:before="0" w:after="0" w:line="240" w:lineRule="auto"/>
+      <w:spacing w:before="0" w:after="0" w:line="197" w:lineRule="auto"/>
     </w:pPr>
     <w:rPr>
       <w:rFonts w:ascii="Montserrat" w:hAnsi="Montserrat" w:eastAsia="Montserrat"/>
@@ -12440,7 +12734,7 @@
         <w:bottom w:val="single" w:sz="6" w:space="5" w:color="262626"/>
         <w:between w:val="single" w:sz="6" w:space="5" w:color="262626"/>
       </w:pBdr>
-      <w:spacing w:before="0" w:after="0" w:line="240" w:lineRule="auto"/>
+      <w:spacing w:before="0" w:after="0" w:line="197" w:lineRule="auto"/>
       <w:jc w:val="right"/>
     </w:pPr>
     <w:rPr>
@@ -12457,7 +12751,7 @@
     <w:basedOn w:val="Normal"/>
     <w:pPr>
       <w:keepNext w:val="0"/>
-      <w:spacing w:before="0" w:after="0" w:line="276" w:lineRule="auto"/>
+      <w:spacing w:before="0" w:after="0" w:line="315" w:lineRule="auto"/>
     </w:pPr>
     <w:rPr>
       <w:rFonts w:ascii="Montserrat" w:hAnsi="Montserrat" w:eastAsia="Montserrat"/>
@@ -12473,7 +12767,7 @@
     <w:basedOn w:val="Normal"/>
     <w:pPr>
       <w:keepNext w:val="0"/>
-      <w:spacing w:before="0" w:after="60" w:line="240" w:lineRule="auto"/>
+      <w:spacing w:before="0" w:after="80" w:line="197" w:lineRule="auto"/>
     </w:pPr>
     <w:rPr>
       <w:rFonts w:ascii="Montserrat" w:hAnsi="Montserrat" w:eastAsia="Montserrat"/>
@@ -12490,7 +12784,7 @@
     <w:basedOn w:val="Normal"/>
     <w:pPr>
       <w:keepNext w:val="0"/>
-      <w:spacing w:before="0" w:after="0" w:line="276" w:lineRule="auto"/>
+      <w:spacing w:before="0" w:after="0" w:line="315" w:lineRule="auto"/>
     </w:pPr>
     <w:rPr>
       <w:rFonts w:ascii="Montserrat" w:hAnsi="Montserrat" w:eastAsia="Montserrat"/>
@@ -12498,7 +12792,7 @@
       <w:i w:val="0"/>
       <w:caps w:val="0"/>
       <w:color w:val="7A7A7A"/>
-      <w:sz w:val="15"/>
+      <w:sz w:val="14"/>
     </w:rPr>
   </w:style>
   <w:style w:type="paragraph" w:customStyle="1" w:styleId="CVRole">
@@ -12509,7 +12803,7 @@
       <w:numPr>
         <w:numId w:val="92"/>
       </w:numPr>
-      <w:spacing w:before="160" w:after="0" w:line="276" w:lineRule="auto"/>
+      <w:spacing w:before="160" w:after="0" w:line="315" w:lineRule="auto"/>
     </w:pPr>
     <w:rPr>
       <w:rFonts w:ascii="Montserrat" w:hAnsi="Montserrat" w:eastAsia="Montserrat"/>
@@ -12525,7 +12819,7 @@
     <w:basedOn w:val="Normal"/>
     <w:pPr>
       <w:keepNext/>
-      <w:spacing w:before="0" w:after="20" w:line="276" w:lineRule="auto"/>
+      <w:spacing w:before="0" w:after="20" w:line="315" w:lineRule="auto"/>
       <w:ind w:left="340"/>
     </w:pPr>
     <w:rPr>
@@ -12542,7 +12836,7 @@
     <w:basedOn w:val="Normal"/>
     <w:pPr>
       <w:keepNext/>
-      <w:spacing w:before="0" w:after="100" w:line="276" w:lineRule="auto"/>
+      <w:spacing w:before="0" w:after="120" w:line="315" w:lineRule="auto"/>
     </w:pPr>
     <w:rPr>
       <w:rFonts w:ascii="Montserrat" w:hAnsi="Montserrat" w:eastAsia="Montserrat"/>
@@ -12555,12 +12849,31 @@
       <w:u w:val="thick" w:color="F6B92B"/>
     </w:rPr>
   </w:style>
+  <w:style w:type="paragraph" w:customStyle="1" w:styleId="CVRoleDate">
+    <w:name w:val="CV Role Date"/>
+    <w:basedOn w:val="Date"/>
+    <w:pPr>
+      <w:keepNext/>
+      <w:spacing w:before="0" w:after="120" w:line="315" w:lineRule="auto"/>
+      <w:ind w:left="340"/>
+    </w:pPr>
+    <w:rPr>
+      <w:rFonts w:ascii="Montserrat" w:hAnsi="Montserrat" w:eastAsia="Montserrat"/>
+      <w:b/>
+      <w:i w:val="0"/>
+      <w:caps w:val="0"/>
+      <w:color w:val="222222"/>
+      <w:sz w:val="14"/>
+      <w:spacing w:val="6"/>
+      <w:u w:val="thick" w:color="F6B92B"/>
+    </w:rPr>
+  </w:style>
   <w:style w:type="paragraph" w:customStyle="1" w:styleId="SidebarText">
     <w:name w:val="Sidebar Text"/>
     <w:basedOn w:val="Normal"/>
     <w:pPr>
       <w:keepNext w:val="0"/>
-      <w:spacing w:before="0" w:after="20" w:line="276" w:lineRule="auto"/>
+      <w:spacing w:before="0" w:after="20" w:line="315" w:lineRule="auto"/>
     </w:pPr>
     <w:rPr>
       <w:rFonts w:ascii="Montserrat" w:hAnsi="Montserrat" w:eastAsia="Montserrat"/>
@@ -12579,7 +12892,7 @@
       <w:tabs>
         <w:tab w:pos="2608" w:val="right"/>
       </w:tabs>
-      <w:spacing w:before="0" w:after="60" w:line="276" w:lineRule="auto"/>
+      <w:spacing w:before="0" w:after="60" w:line="315" w:lineRule="auto"/>
     </w:pPr>
     <w:rPr>
       <w:rFonts w:ascii="Montserrat" w:hAnsi="Montserrat" w:eastAsia="Montserrat"/>
@@ -12595,7 +12908,7 @@
     <w:basedOn w:val="Normal"/>
     <w:pPr>
       <w:keepNext w:val="0"/>
-      <w:spacing w:before="0" w:after="40" w:line="276" w:lineRule="auto"/>
+      <w:spacing w:before="0" w:after="40" w:line="315" w:lineRule="auto"/>
     </w:pPr>
     <w:rPr>
       <w:rFonts w:ascii="Montserrat" w:hAnsi="Montserrat" w:eastAsia="Montserrat"/>
@@ -12611,7 +12924,7 @@
     <w:basedOn w:val="Normal"/>
     <w:pPr>
       <w:keepNext w:val="0"/>
-      <w:spacing w:before="0" w:after="100" w:line="240" w:lineRule="auto"/>
+      <w:spacing w:before="0" w:after="120" w:line="197" w:lineRule="auto"/>
     </w:pPr>
     <w:rPr>
       <w:rFonts w:ascii="Montserrat" w:hAnsi="Montserrat" w:eastAsia="Montserrat"/>
@@ -12627,7 +12940,7 @@
     <w:basedOn w:val="Normal"/>
     <w:pPr>
       <w:keepNext w:val="0"/>
-      <w:spacing w:before="0" w:after="160" w:line="408" w:lineRule="auto"/>
+      <w:spacing w:before="0" w:after="200" w:line="354" w:lineRule="auto"/>
       <w:ind w:left="340"/>
     </w:pPr>
     <w:rPr>
@@ -12647,7 +12960,7 @@
       <w:pBdr>
         <w:left w:val="single" w:sz="18" w:space="8" w:color="F6B92B"/>
       </w:pBdr>
-      <w:spacing w:before="0" w:after="60" w:line="276" w:lineRule="auto"/>
+      <w:spacing w:before="0" w:after="60" w:line="315" w:lineRule="auto"/>
       <w:ind w:left="227"/>
     </w:pPr>
     <w:rPr>
@@ -12656,7 +12969,7 @@
       <w:i/>
       <w:caps w:val="0"/>
       <w:color w:val="3A3A3A"/>
-      <w:sz w:val="18"/>
+      <w:sz w:val="19"/>
     </w:rPr>
   </w:style>
   <w:style w:type="paragraph" w:customStyle="1" w:styleId="SidebarSectionsSpacing">
@@ -12664,7 +12977,7 @@
     <w:basedOn w:val="Normal"/>
     <w:pPr>
       <w:keepNext w:val="0"/>
-      <w:spacing w:before="0" w:after="280" w:line="276" w:lineRule="auto"/>
+      <w:spacing w:before="0" w:after="320" w:line="315" w:lineRule="auto"/>
     </w:pPr>
     <w:rPr>
       <w:rFonts w:ascii="Montserrat" w:hAnsi="Montserrat" w:eastAsia="Montserrat"/>
@@ -12680,7 +12993,7 @@
     <w:basedOn w:val="Normal"/>
     <w:pPr>
       <w:keepNext w:val="0"/>
-      <w:spacing w:before="0" w:after="440" w:line="276" w:lineRule="auto"/>
+      <w:spacing w:before="0" w:after="520" w:line="315" w:lineRule="auto"/>
     </w:pPr>
     <w:rPr>
       <w:rFonts w:ascii="Montserrat" w:hAnsi="Montserrat" w:eastAsia="Montserrat"/>

</xml_diff>

<commit_message>
fix(docx): bracket.docx layout in Microsoft Word
LibreOffice renders hid three Word-only faults, now checked in Word itself:
- Word 2010 compatibility mode aligns a table's first-cell text with the margin, pushing the
  sidebar and its diamonds off the page: set mode 15.
- Word links a list to one style, so the sidebar headings lost their diamonds: one list per style.
- Word glues a no-break space to neighbouring spaces, so chips broke mid-word: a zero-width
  space after each separator, and a shaded narrow no-break space for the chip edge.
</commit_message>
<xml_diff>
--- a/templates/bracket.docx
+++ b/templates/bracket.docx
@@ -572,6 +572,22 @@
     <w:lvl w:ilvl="0">
       <w:start w:val="1"/>
       <w:numFmt w:val="bullet"/>
+      <w:lvlText w:val="◆"/>
+      <w:lvlJc w:val="left"/>
+      <w:pPr>
+        <w:ind w:left="400" w:hanging="400"/>
+      </w:pPr>
+      <w:rPr>
+        <w:rFonts w:ascii="Segoe UI Symbol" w:hAnsi="Segoe UI Symbol"/>
+        <w:color w:val="F6B92B"/>
+        <w:sz w:val="22"/>
+      </w:rPr>
+    </w:lvl>
+  </w:abstractNum>
+  <w:abstractNum w:abstractNumId="93">
+    <w:lvl w:ilvl="0">
+      <w:start w:val="1"/>
+      <w:numFmt w:val="bullet"/>
       <w:lvlText w:val="○"/>
       <w:lvlJc w:val="left"/>
       <w:pPr>
@@ -790,6 +806,9 @@
   </w:num>
   <w:num w:numId="92">
     <w:abstractNumId w:val="92"/>
+  </w:num>
+  <w:num w:numId="93">
+    <w:abstractNumId w:val="93"/>
   </w:num>
 </w:numbering>
 </file>
@@ -1078,7 +1097,7 @@
       <w:keepNext/>
       <w:keepLines/>
       <w:numPr>
-        <w:numId w:val="91"/>
+        <w:numId w:val="92"/>
       </w:numPr>
       <w:spacing w:before="0" w:after="120" w:line="236" w:lineRule="auto"/>
       <w:outlineLvl w:val="2"/>
@@ -12801,7 +12820,7 @@
     <w:pPr>
       <w:keepNext/>
       <w:numPr>
-        <w:numId w:val="92"/>
+        <w:numId w:val="93"/>
       </w:numPr>
       <w:spacing w:before="160" w:after="0" w:line="315" w:lineRule="auto"/>
     </w:pPr>
@@ -13025,6 +13044,14 @@
       <w:rFonts w:ascii="Montserrat" w:hAnsi="Montserrat"/>
       <w:sz w:val="14"/>
       <w:shd w:val="clear" w:color="auto" w:fill="F4F3EF"/>
+    </w:rPr>
+  </w:style>
+  <w:style w:type="character" w:customStyle="1" w:styleId="CVToolMark">
+    <w:name w:val="CV Tool Mark"/>
+    <w:rPr>
+      <w:rFonts w:ascii="Montserrat" w:hAnsi="Montserrat"/>
+      <w:sz w:val="14"/>
+      <w:shd w:val="clear" w:color="auto" w:fill="F6B92B"/>
     </w:rPr>
   </w:style>
   <w:style w:type="character" w:customStyle="1" w:styleId="CVSkillFill">

</xml_diff>

<commit_message>
refactor: package as src/resume with a `resume build` CLI
One command builds index.html and, per language, the PDF and .docx in
parallel. Typed throughout (ty), linted and formatted with ruff; tests
split into pytest modules. Template generators share their helpers.

fix(bracket): docx text ink 222222 -> 262626, matching bracket.css.
</commit_message>
<xml_diff>
--- a/templates/bracket.docx
+++ b/templates/bracket.docx
@@ -982,7 +982,7 @@
       <w:b w:val="0"/>
       <w:i w:val="0"/>
       <w:caps w:val="0"/>
-      <w:color w:val="222222"/>
+      <w:color w:val="262626"/>
       <w:sz w:val="19"/>
     </w:rPr>
   </w:style>
@@ -1053,7 +1053,7 @@
       <w:bCs/>
       <w:i w:val="0"/>
       <w:caps w:val="0"/>
-      <w:color w:val="222222"/>
+      <w:color w:val="262626"/>
       <w:sz w:val="25"/>
       <w:szCs w:val="28"/>
     </w:rPr>
@@ -1079,7 +1079,7 @@
       <w:bCs/>
       <w:i w:val="0"/>
       <w:caps w:val="0"/>
-      <w:color w:val="222222"/>
+      <w:color w:val="262626"/>
       <w:sz w:val="19"/>
       <w:szCs w:val="26"/>
     </w:rPr>
@@ -1108,7 +1108,7 @@
       <w:bCs/>
       <w:i w:val="0"/>
       <w:caps w:val="0"/>
-      <w:color w:val="222222"/>
+      <w:color w:val="262626"/>
       <w:sz w:val="21"/>
     </w:rPr>
   </w:style>
@@ -1429,7 +1429,7 @@
       <w:b w:val="0"/>
       <w:i w:val="0"/>
       <w:caps w:val="0"/>
-      <w:color w:val="222222"/>
+      <w:color w:val="262626"/>
       <w:sz w:val="19"/>
     </w:rPr>
   </w:style>
@@ -12706,7 +12706,7 @@
       <w:b/>
       <w:i w:val="0"/>
       <w:caps/>
-      <w:color w:val="222222"/>
+      <w:color w:val="262626"/>
       <w:sz w:val="55"/>
     </w:rPr>
   </w:style>
@@ -12739,7 +12739,7 @@
       <w:b w:val="0"/>
       <w:i w:val="0"/>
       <w:caps w:val="0"/>
-      <w:color w:val="222222"/>
+      <w:color w:val="262626"/>
       <w:sz w:val="4"/>
     </w:rPr>
   </w:style>
@@ -12761,7 +12761,7 @@
       <w:b/>
       <w:i w:val="0"/>
       <w:caps w:val="0"/>
-      <w:color w:val="222222"/>
+      <w:color w:val="262626"/>
       <w:sz w:val="16"/>
     </w:rPr>
   </w:style>
@@ -12777,7 +12777,7 @@
       <w:b w:val="0"/>
       <w:i w:val="0"/>
       <w:caps w:val="0"/>
-      <w:color w:val="222222"/>
+      <w:color w:val="262626"/>
       <w:sz w:val="4"/>
     </w:rPr>
   </w:style>
@@ -12793,7 +12793,7 @@
       <w:b/>
       <w:i w:val="0"/>
       <w:caps w:val="0"/>
-      <w:color w:val="222222"/>
+      <w:color w:val="262626"/>
       <w:sz w:val="36"/>
       <w:u w:val="thick" w:color="F6B92B"/>
     </w:rPr>
@@ -12829,7 +12829,7 @@
       <w:b/>
       <w:i w:val="0"/>
       <w:caps w:val="0"/>
-      <w:color w:val="222222"/>
+      <w:color w:val="262626"/>
       <w:sz w:val="19"/>
     </w:rPr>
   </w:style>
@@ -12862,7 +12862,7 @@
       <w:b/>
       <w:i w:val="0"/>
       <w:caps w:val="0"/>
-      <w:color w:val="222222"/>
+      <w:color w:val="262626"/>
       <w:sz w:val="14"/>
       <w:spacing w:val="6"/>
       <w:u w:val="thick" w:color="F6B92B"/>
@@ -12881,7 +12881,7 @@
       <w:b/>
       <w:i w:val="0"/>
       <w:caps w:val="0"/>
-      <w:color w:val="222222"/>
+      <w:color w:val="262626"/>
       <w:sz w:val="14"/>
       <w:spacing w:val="6"/>
       <w:u w:val="thick" w:color="F6B92B"/>
@@ -12899,7 +12899,7 @@
       <w:b w:val="0"/>
       <w:i w:val="0"/>
       <w:caps w:val="0"/>
-      <w:color w:val="222222"/>
+      <w:color w:val="262626"/>
       <w:sz w:val="17"/>
     </w:rPr>
   </w:style>
@@ -12918,7 +12918,7 @@
       <w:b w:val="0"/>
       <w:i w:val="0"/>
       <w:caps w:val="0"/>
-      <w:color w:val="222222"/>
+      <w:color w:val="262626"/>
       <w:sz w:val="17"/>
     </w:rPr>
   </w:style>
@@ -12934,7 +12934,7 @@
       <w:b w:val="0"/>
       <w:i w:val="0"/>
       <w:caps w:val="0"/>
-      <w:color w:val="222222"/>
+      <w:color w:val="262626"/>
       <w:sz w:val="17"/>
     </w:rPr>
   </w:style>
@@ -12950,7 +12950,7 @@
       <w:b w:val="0"/>
       <w:i w:val="0"/>
       <w:caps w:val="0"/>
-      <w:color w:val="222222"/>
+      <w:color w:val="262626"/>
       <w:sz w:val="2"/>
     </w:rPr>
   </w:style>
@@ -12967,7 +12967,7 @@
       <w:b w:val="0"/>
       <w:i w:val="0"/>
       <w:caps w:val="0"/>
-      <w:color w:val="222222"/>
+      <w:color w:val="262626"/>
       <w:sz w:val="14"/>
     </w:rPr>
   </w:style>
@@ -13003,7 +13003,7 @@
       <w:b w:val="0"/>
       <w:i w:val="0"/>
       <w:caps w:val="0"/>
-      <w:color w:val="222222"/>
+      <w:color w:val="262626"/>
       <w:sz w:val="8"/>
     </w:rPr>
   </w:style>
@@ -13019,7 +13019,7 @@
       <w:b w:val="0"/>
       <w:i w:val="0"/>
       <w:caps w:val="0"/>
-      <w:color w:val="222222"/>
+      <w:color w:val="262626"/>
       <w:sz w:val="8"/>
     </w:rPr>
   </w:style>

</xml_diff>

<commit_message>
feat(docx): a Word template per theme
Shared generator helpers (fonts, page shapes, Word settings). Bold styles use the font's bold family and **bold** text a CVStrong style, so Word for Mac prints real bold. tools/compare.sh renders PDF and Word pages side by side. `resume template aurora-v2` maps to module aurora_v2.
</commit_message>
<xml_diff>
--- a/templates/bracket.docx
+++ b/templates/bracket.docx
@@ -45,7 +45,7 @@
           <w:tcPr>
             <w:tcW w:type="dxa" w:w="5272"/>
             <w:tcMar>
-              <w:top w:w="510" w:type="dxa"/>
+              <w:top w:w="283" w:type="dxa"/>
               <w:left w:w="340" w:type="dxa"/>
               <w:bottom w:w="0" w:type="dxa"/>
               <w:right w:w="226" w:type="dxa"/>
@@ -73,7 +73,7 @@
           <w:tcPr>
             <w:tcW w:type="dxa" w:w="3402"/>
             <w:tcMar>
-              <w:top w:w="510" w:type="dxa"/>
+              <w:top w:w="198" w:type="dxa"/>
               <w:left w:w="226" w:type="dxa"/>
               <w:bottom w:w="0" w:type="dxa"/>
               <w:right w:w="793" w:type="dxa"/>
@@ -92,7 +92,7 @@
       </w:tr>
       <w:tr>
         <w:trPr>
-          <w:trHeight w:val="1361" w:hRule="exact"/>
+          <w:trHeight w:val="1106" w:hRule="exact"/>
         </w:trPr>
         <w:tc>
           <w:tcPr>
@@ -141,7 +141,7 @@
           <w:tcPr>
             <w:tcW w:type="dxa" w:w="3628"/>
             <w:tcMar>
-              <w:top w:w="170" w:type="dxa"/>
+              <w:top w:w="0" w:type="dxa"/>
               <w:left w:w="567" w:type="dxa"/>
               <w:bottom w:w="0" w:type="dxa"/>
               <w:right w:w="453" w:type="dxa"/>
@@ -157,7 +157,7 @@
           <w:tcPr>
             <w:tcW w:type="dxa" w:w="8277"/>
             <w:tcMar>
-              <w:top w:w="567" w:type="dxa"/>
+              <w:top w:w="510" w:type="dxa"/>
               <w:left w:w="567" w:type="dxa"/>
               <w:bottom w:w="0" w:type="dxa"/>
               <w:right w:w="793" w:type="dxa"/>
@@ -363,9 +363,9 @@
             <wp:posOffset>0</wp:posOffset>
           </wp:positionH>
           <wp:positionV relativeFrom="page">
-            <wp:posOffset>2736000</wp:posOffset>
+            <wp:posOffset>2880000</wp:posOffset>
           </wp:positionV>
-          <wp:extent cx="2304000" cy="7956000"/>
+          <wp:extent cx="2304000" cy="7812000"/>
           <wp:effectExtent l="0" t="0" r="0" b="0"/>
           <wp:wrapNone/>
           <wp:docPr id="1005" name="Shape 1005"/>
@@ -377,7 +377,7 @@
                 <wps:spPr>
                   <a:xfrm>
                     <a:off x="0" y="0"/>
-                    <a:ext cx="2304000" cy="7956000"/>
+                    <a:ext cx="2304000" cy="7812000"/>
                   </a:xfrm>
                   <a:prstGeom prst="rect">
                     <a:avLst/>
@@ -446,7 +446,7 @@
   <w:p>
     <w:pPr>
       <w:pStyle w:val="CVPhoto"/>
-      <w:spacing w:before="737"/>
+      <w:spacing w:before="283"/>
     </w:pPr>
     <w:r xmlns:a="http://schemas.openxmlformats.org/drawingml/2006/main">
       <w:drawing>
@@ -975,7 +975,7 @@
     <w:rsid w:val="00FC693F"/>
     <w:pPr>
       <w:keepNext w:val="0"/>
-      <w:spacing w:before="0" w:after="80" w:line="315" w:lineRule="auto"/>
+      <w:spacing w:before="0" w:after="170" w:line="315" w:lineRule="auto"/>
     </w:pPr>
     <w:rPr>
       <w:rFonts w:ascii="Montserrat" w:hAnsi="Montserrat" w:eastAsia="Montserrat"/>
@@ -1044,13 +1044,11 @@
       <w:numPr>
         <w:numId w:val="91"/>
       </w:numPr>
-      <w:spacing w:before="0" w:after="160" w:line="236" w:lineRule="auto"/>
+      <w:spacing w:before="440" w:after="330" w:line="236" w:lineRule="auto"/>
       <w:outlineLvl w:val="0"/>
     </w:pPr>
     <w:rPr>
-      <w:rFonts w:ascii="Montserrat" w:hAnsi="Montserrat" w:eastAsia="Montserrat"/>
-      <w:b/>
-      <w:bCs/>
+      <w:rFonts w:ascii="Montserrat Bold" w:hAnsi="Montserrat Bold" w:eastAsia="Montserrat Bold" w:cs="Montserrat Bold"/>
       <w:i w:val="0"/>
       <w:caps w:val="0"/>
       <w:color w:val="262626"/>
@@ -1074,9 +1072,7 @@
       <w:outlineLvl w:val="1"/>
     </w:pPr>
     <w:rPr>
-      <w:rFonts w:ascii="Montserrat" w:hAnsi="Montserrat" w:eastAsia="Montserrat"/>
-      <w:b/>
-      <w:bCs/>
+      <w:rFonts w:ascii="Montserrat Bold" w:hAnsi="Montserrat Bold" w:eastAsia="Montserrat Bold" w:cs="Montserrat Bold"/>
       <w:i w:val="0"/>
       <w:caps w:val="0"/>
       <w:color w:val="262626"/>
@@ -1099,13 +1095,11 @@
       <w:numPr>
         <w:numId w:val="92"/>
       </w:numPr>
-      <w:spacing w:before="0" w:after="120" w:line="236" w:lineRule="auto"/>
+      <w:spacing w:before="0" w:after="240" w:line="236" w:lineRule="auto"/>
       <w:outlineLvl w:val="2"/>
     </w:pPr>
     <w:rPr>
-      <w:rFonts w:ascii="Montserrat" w:hAnsi="Montserrat" w:eastAsia="Montserrat"/>
-      <w:b/>
-      <w:bCs/>
+      <w:rFonts w:ascii="Montserrat Bold" w:hAnsi="Montserrat Bold" w:eastAsia="Montserrat Bold" w:cs="Montserrat Bold"/>
       <w:i w:val="0"/>
       <w:caps w:val="0"/>
       <w:color w:val="262626"/>
@@ -1129,9 +1123,7 @@
       <w:outlineLvl w:val="3"/>
     </w:pPr>
     <w:rPr>
-      <w:rFonts w:ascii="Montserrat" w:hAnsi="Montserrat" w:eastAsia="Montserrat"/>
-      <w:b/>
-      <w:bCs/>
+      <w:rFonts w:ascii="Montserrat Bold" w:hAnsi="Montserrat Bold" w:eastAsia="Montserrat Bold" w:cs="Montserrat Bold"/>
       <w:i w:val="0"/>
       <w:iCs/>
       <w:caps/>
@@ -1802,8 +1794,7 @@
       <w:spacing w:line="240" w:lineRule="auto"/>
     </w:pPr>
     <w:rPr>
-      <w:b/>
-      <w:bCs/>
+      <w:rFonts w:ascii="Montserrat Bold" w:hAnsi="Montserrat Bold" w:eastAsia="Montserrat Bold" w:cs="Montserrat Bold"/>
       <w:color w:val="4F81BD" w:themeColor="accent1"/>
       <w:sz w:val="18"/>
       <w:szCs w:val="18"/>
@@ -1847,8 +1838,7 @@
       <w:ind w:left="936" w:right="936"/>
     </w:pPr>
     <w:rPr>
-      <w:b/>
-      <w:bCs/>
+      <w:rFonts w:ascii="Montserrat Bold" w:hAnsi="Montserrat Bold" w:eastAsia="Montserrat Bold" w:cs="Montserrat Bold"/>
       <w:i/>
       <w:iCs/>
       <w:color w:val="4F81BD" w:themeColor="accent1"/>
@@ -12702,8 +12692,7 @@
       <w:spacing w:before="0" w:after="0" w:line="197" w:lineRule="auto"/>
     </w:pPr>
     <w:rPr>
-      <w:rFonts w:ascii="Montserrat" w:hAnsi="Montserrat" w:eastAsia="Montserrat"/>
-      <w:b/>
+      <w:rFonts w:ascii="Montserrat Bold" w:hAnsi="Montserrat Bold" w:eastAsia="Montserrat Bold" w:cs="Montserrat Bold"/>
       <w:i w:val="0"/>
       <w:caps/>
       <w:color w:val="262626"/>
@@ -12749,16 +12738,15 @@
     <w:pPr>
       <w:keepNext/>
       <w:pBdr>
-        <w:top w:val="single" w:sz="6" w:space="5" w:color="262626"/>
-        <w:bottom w:val="single" w:sz="6" w:space="5" w:color="262626"/>
-        <w:between w:val="single" w:sz="6" w:space="5" w:color="262626"/>
+        <w:top w:val="single" w:sz="6" w:space="7" w:color="262626"/>
+        <w:bottom w:val="single" w:sz="6" w:space="7" w:color="262626"/>
+        <w:between w:val="single" w:sz="6" w:space="7" w:color="262626"/>
       </w:pBdr>
       <w:spacing w:before="0" w:after="0" w:line="197" w:lineRule="auto"/>
       <w:jc w:val="right"/>
     </w:pPr>
     <w:rPr>
-      <w:rFonts w:ascii="Montserrat" w:hAnsi="Montserrat" w:eastAsia="Montserrat"/>
-      <w:b/>
+      <w:rFonts w:ascii="Montserrat Bold" w:hAnsi="Montserrat Bold" w:eastAsia="Montserrat Bold" w:cs="Montserrat Bold"/>
       <w:i w:val="0"/>
       <w:caps w:val="0"/>
       <w:color w:val="262626"/>
@@ -12786,11 +12774,10 @@
     <w:basedOn w:val="Normal"/>
     <w:pPr>
       <w:keepNext w:val="0"/>
-      <w:spacing w:before="0" w:after="80" w:line="197" w:lineRule="auto"/>
+      <w:spacing w:before="0" w:after="256" w:line="197" w:lineRule="auto"/>
     </w:pPr>
     <w:rPr>
-      <w:rFonts w:ascii="Montserrat" w:hAnsi="Montserrat" w:eastAsia="Montserrat"/>
-      <w:b/>
+      <w:rFonts w:ascii="Montserrat Bold" w:hAnsi="Montserrat Bold" w:eastAsia="Montserrat Bold" w:cs="Montserrat Bold"/>
       <w:i w:val="0"/>
       <w:caps w:val="0"/>
       <w:color w:val="262626"/>
@@ -12825,8 +12812,7 @@
       <w:spacing w:before="160" w:after="0" w:line="315" w:lineRule="auto"/>
     </w:pPr>
     <w:rPr>
-      <w:rFonts w:ascii="Montserrat" w:hAnsi="Montserrat" w:eastAsia="Montserrat"/>
-      <w:b/>
+      <w:rFonts w:ascii="Montserrat Bold" w:hAnsi="Montserrat Bold" w:eastAsia="Montserrat Bold" w:cs="Montserrat Bold"/>
       <w:i w:val="0"/>
       <w:caps w:val="0"/>
       <w:color w:val="262626"/>
@@ -12838,7 +12824,7 @@
     <w:basedOn w:val="Normal"/>
     <w:pPr>
       <w:keepNext/>
-      <w:spacing w:before="0" w:after="20" w:line="315" w:lineRule="auto"/>
+      <w:spacing w:before="0" w:after="72" w:line="289" w:lineRule="auto"/>
       <w:ind w:left="340"/>
     </w:pPr>
     <w:rPr>
@@ -12855,11 +12841,10 @@
     <w:basedOn w:val="Normal"/>
     <w:pPr>
       <w:keepNext/>
-      <w:spacing w:before="0" w:after="120" w:line="315" w:lineRule="auto"/>
+      <w:spacing w:before="0" w:after="132" w:line="315" w:lineRule="auto"/>
     </w:pPr>
     <w:rPr>
-      <w:rFonts w:ascii="Montserrat" w:hAnsi="Montserrat" w:eastAsia="Montserrat"/>
-      <w:b/>
+      <w:rFonts w:ascii="Montserrat Bold" w:hAnsi="Montserrat Bold" w:eastAsia="Montserrat Bold" w:cs="Montserrat Bold"/>
       <w:i w:val="0"/>
       <w:caps w:val="0"/>
       <w:color w:val="262626"/>
@@ -12873,12 +12858,11 @@
     <w:basedOn w:val="Date"/>
     <w:pPr>
       <w:keepNext/>
-      <w:spacing w:before="0" w:after="120" w:line="315" w:lineRule="auto"/>
+      <w:spacing w:before="0" w:after="132" w:line="315" w:lineRule="auto"/>
       <w:ind w:left="340"/>
     </w:pPr>
     <w:rPr>
-      <w:rFonts w:ascii="Montserrat" w:hAnsi="Montserrat" w:eastAsia="Montserrat"/>
-      <w:b/>
+      <w:rFonts w:ascii="Montserrat Bold" w:hAnsi="Montserrat Bold" w:eastAsia="Montserrat Bold" w:cs="Montserrat Bold"/>
       <w:i w:val="0"/>
       <w:caps w:val="0"/>
       <w:color w:val="262626"/>
@@ -12927,7 +12911,7 @@
     <w:basedOn w:val="Normal"/>
     <w:pPr>
       <w:keepNext w:val="0"/>
-      <w:spacing w:before="0" w:after="40" w:line="315" w:lineRule="auto"/>
+      <w:spacing w:before="0" w:after="60" w:line="315" w:lineRule="auto"/>
     </w:pPr>
     <w:rPr>
       <w:rFonts w:ascii="Montserrat" w:hAnsi="Montserrat" w:eastAsia="Montserrat"/>
@@ -12959,7 +12943,7 @@
     <w:basedOn w:val="Normal"/>
     <w:pPr>
       <w:keepNext w:val="0"/>
-      <w:spacing w:before="0" w:after="200" w:line="354" w:lineRule="auto"/>
+      <w:spacing w:before="120" w:after="252" w:line="473" w:lineRule="auto"/>
       <w:ind w:left="340"/>
     </w:pPr>
     <w:rPr>
@@ -12979,7 +12963,7 @@
       <w:pBdr>
         <w:left w:val="single" w:sz="18" w:space="8" w:color="F6B92B"/>
       </w:pBdr>
-      <w:spacing w:before="0" w:after="60" w:line="315" w:lineRule="auto"/>
+      <w:spacing w:before="0" w:after="240" w:line="315" w:lineRule="auto"/>
       <w:ind w:left="227"/>
     </w:pPr>
     <w:rPr>
@@ -12996,7 +12980,7 @@
     <w:basedOn w:val="Normal"/>
     <w:pPr>
       <w:keepNext w:val="0"/>
-      <w:spacing w:before="0" w:after="320" w:line="315" w:lineRule="auto"/>
+      <w:spacing w:before="0" w:after="520" w:line="197" w:lineRule="auto"/>
     </w:pPr>
     <w:rPr>
       <w:rFonts w:ascii="Montserrat" w:hAnsi="Montserrat" w:eastAsia="Montserrat"/>
@@ -13004,7 +12988,7 @@
       <w:i w:val="0"/>
       <w:caps w:val="0"/>
       <w:color w:val="262626"/>
-      <w:sz w:val="8"/>
+      <w:sz w:val="2"/>
     </w:rPr>
   </w:style>
   <w:style w:type="paragraph" w:customStyle="1" w:styleId="MainSectionsSpacing">
@@ -13012,7 +12996,7 @@
     <w:basedOn w:val="Normal"/>
     <w:pPr>
       <w:keepNext w:val="0"/>
-      <w:spacing w:before="0" w:after="520" w:line="315" w:lineRule="auto"/>
+      <w:spacing w:before="0" w:after="0" w:line="197" w:lineRule="auto"/>
     </w:pPr>
     <w:rPr>
       <w:rFonts w:ascii="Montserrat" w:hAnsi="Montserrat" w:eastAsia="Montserrat"/>
@@ -13020,7 +13004,7 @@
       <w:i w:val="0"/>
       <w:caps w:val="0"/>
       <w:color w:val="262626"/>
-      <w:sz w:val="8"/>
+      <w:sz w:val="2"/>
     </w:rPr>
   </w:style>
   <w:style w:type="character" w:customStyle="1" w:styleId="CVAccent">
@@ -13066,6 +13050,12 @@
     <w:rPr>
       <w:rFonts w:ascii="Montserrat" w:hAnsi="Montserrat"/>
       <w:shd w:val="clear" w:color="auto" w:fill="DDDBD3"/>
+    </w:rPr>
+  </w:style>
+  <w:style w:type="character" w:customStyle="1" w:styleId="CVStrong">
+    <w:name w:val="CV Strong"/>
+    <w:rPr>
+      <w:rFonts w:ascii="Montserrat Bold" w:hAnsi="Montserrat Bold"/>
     </w:rPr>
   </w:style>
 </w:styles>

</xml_diff>